<commit_message>
Aggiorna percorso/nome modello polpo, aggiungi model_version e rimuovi version da health
</commit_message>
<xml_diff>
--- a/Guida_Despite_Fraud_API.docx
+++ b/Guida_Despite_Fraud_API.docx
@@ -250,13 +250,23 @@
             <w:pPr>
               <w:spacing w:after="0"/>
             </w:pPr>
+            <w:proofErr w:type="spellStart"/>
             <w:r>
               <w:rPr>
                 <w:b/>
                 <w:color w:val="1B365D"/>
                 <w:sz w:val="18"/>
               </w:rPr>
-              <w:t xml:space="preserve">Autenticazione: </w:t>
+              <w:t>Autenticazione</w:t>
+            </w:r>
+            <w:proofErr w:type="spellEnd"/>
+            <w:r>
+              <w:rPr>
+                <w:b/>
+                <w:color w:val="1B365D"/>
+                <w:sz w:val="18"/>
+              </w:rPr>
+              <w:t xml:space="preserve">: </w:t>
             </w:r>
             <w:r>
               <w:rPr>
@@ -339,16 +349,7 @@
                 <w:sz w:val="18"/>
                 <w:lang w:val="it-IT"/>
               </w:rPr>
-              <w:t>Autori</w:t>
-            </w:r>
-            <w:r>
-              <w:rPr>
-                <w:b/>
-                <w:color w:val="1B365D"/>
-                <w:sz w:val="18"/>
-                <w:lang w:val="it-IT"/>
-              </w:rPr>
-              <w:t xml:space="preserve">: </w:t>
+              <w:t xml:space="preserve">Autori: </w:t>
             </w:r>
             <w:r>
               <w:rPr>
@@ -399,15 +400,7 @@
                   <w:sz w:val="18"/>
                   <w:lang w:val="it-IT"/>
                 </w:rPr>
-                <w:t>r</w:t>
-              </w:r>
-              <w:r>
-                <w:rPr>
-                  <w:rStyle w:val="Collegamentoipertestuale"/>
-                  <w:sz w:val="18"/>
-                  <w:lang w:val="it-IT"/>
-                </w:rPr>
-                <w:t>uggero.pensa@unito.it</w:t>
+                <w:t>ruggero.pensa@unito.it</w:t>
               </w:r>
             </w:hyperlink>
             <w:r>
@@ -787,6 +780,109 @@
           <w:lang w:val="it-IT"/>
         </w:rPr>
         <w:t xml:space="preserve"> SERS.</w:t>
+      </w:r>
+    </w:p>
+    <w:p>
+      <w:pPr>
+        <w:spacing w:after="80"/>
+        <w:jc w:val="both"/>
+        <w:rPr>
+          <w:rFonts w:ascii="Calibri" w:hAnsi="Calibri"/>
+          <w:color w:val="1F2937"/>
+          <w:sz w:val="20"/>
+          <w:lang w:val="it-IT"/>
+        </w:rPr>
+      </w:pPr>
+      <w:r>
+        <w:rPr>
+          <w:rFonts w:ascii="Calibri" w:hAnsi="Calibri"/>
+          <w:color w:val="1F2937"/>
+          <w:sz w:val="20"/>
+          <w:lang w:val="it-IT"/>
+        </w:rPr>
+        <w:t xml:space="preserve">Il servizio </w:t>
+      </w:r>
+      <w:proofErr w:type="spellStart"/>
+      <w:r>
+        <w:rPr>
+          <w:rFonts w:ascii="Calibri" w:hAnsi="Calibri"/>
+          <w:color w:val="1F2937"/>
+          <w:sz w:val="20"/>
+          <w:lang w:val="it-IT"/>
+        </w:rPr>
+        <w:t>Despite</w:t>
+      </w:r>
+      <w:proofErr w:type="spellEnd"/>
+      <w:r>
+        <w:rPr>
+          <w:rFonts w:ascii="Calibri" w:hAnsi="Calibri"/>
+          <w:color w:val="1F2937"/>
+          <w:sz w:val="20"/>
+          <w:lang w:val="it-IT"/>
+        </w:rPr>
+        <w:t xml:space="preserve"> Fraud API è stato realizzato usando il framework </w:t>
+      </w:r>
+      <w:proofErr w:type="spellStart"/>
+      <w:r>
+        <w:rPr>
+          <w:rFonts w:ascii="Calibri" w:hAnsi="Calibri"/>
+          <w:b/>
+          <w:bCs/>
+          <w:color w:val="1F2937"/>
+          <w:sz w:val="20"/>
+          <w:lang w:val="it-IT"/>
+        </w:rPr>
+        <w:t>FastAPI</w:t>
+      </w:r>
+      <w:proofErr w:type="spellEnd"/>
+      <w:r>
+        <w:rPr>
+          <w:rFonts w:ascii="Calibri" w:hAnsi="Calibri"/>
+          <w:b/>
+          <w:bCs/>
+          <w:color w:val="1F2937"/>
+          <w:sz w:val="20"/>
+          <w:lang w:val="it-IT"/>
+        </w:rPr>
+        <w:t xml:space="preserve"> v.</w:t>
+      </w:r>
+      <w:r>
+        <w:rPr>
+          <w:rFonts w:ascii="Calibri" w:hAnsi="Calibri"/>
+          <w:b/>
+          <w:bCs/>
+          <w:color w:val="1F2937"/>
+          <w:sz w:val="20"/>
+          <w:lang w:val="it-IT"/>
+        </w:rPr>
+        <w:t>0.136.3</w:t>
+      </w:r>
+      <w:r>
+        <w:rPr>
+          <w:rFonts w:ascii="Calibri" w:hAnsi="Calibri"/>
+          <w:color w:val="1F2937"/>
+          <w:sz w:val="20"/>
+          <w:lang w:val="it-IT"/>
+        </w:rPr>
+        <w:t xml:space="preserve"> (</w:t>
+      </w:r>
+      <w:r>
+        <w:rPr>
+          <w:rFonts w:ascii="Calibri" w:hAnsi="Calibri"/>
+          <w:color w:val="1F2937"/>
+          <w:sz w:val="20"/>
+          <w:lang w:val="it-IT"/>
+        </w:rPr>
+        <w:t>2026-05-23</w:t>
+      </w:r>
+      <w:r>
+        <w:rPr>
+          <w:rFonts w:ascii="Calibri" w:hAnsi="Calibri"/>
+          <w:color w:val="1F2937"/>
+          <w:sz w:val="20"/>
+          <w:lang w:val="it-IT"/>
+        </w:rPr>
+        <w:t>).</w:t>
       </w:r>
     </w:p>
     <w:p>
@@ -1070,7 +1166,43 @@
           <w:sz w:val="20"/>
           <w:lang w:val="it-IT"/>
         </w:rPr>
-        <w:t xml:space="preserve"> è il punto di ingresso per inviare uno spettro e ricevere in tempo reale la classificazione con il relativo indice di confidenza (probabilità).</w:t>
+        <w:t xml:space="preserve"> è il punto di ingresso per inviare uno spettro e ricevere in tempo reale la classificazione con </w:t>
+      </w:r>
+      <w:r>
+        <w:rPr>
+          <w:rFonts w:ascii="Calibri" w:hAnsi="Calibri"/>
+          <w:color w:val="1F2937"/>
+          <w:sz w:val="20"/>
+          <w:lang w:val="it-IT"/>
+        </w:rPr>
+        <w:t xml:space="preserve">la relativa </w:t>
+      </w:r>
+      <w:r>
+        <w:rPr>
+          <w:rFonts w:ascii="Calibri" w:hAnsi="Calibri"/>
+          <w:color w:val="1F2937"/>
+          <w:sz w:val="20"/>
+          <w:lang w:val="it-IT"/>
+        </w:rPr>
+        <w:t>probabilità</w:t>
+      </w:r>
+      <w:r>
+        <w:rPr>
+          <w:rFonts w:ascii="Calibri" w:hAnsi="Calibri"/>
+          <w:color w:val="1F2937"/>
+          <w:sz w:val="20"/>
+          <w:lang w:val="it-IT"/>
+        </w:rPr>
+        <w:t xml:space="preserve"> di predizione</w:t>
+      </w:r>
+      <w:r>
+        <w:rPr>
+          <w:rFonts w:ascii="Calibri" w:hAnsi="Calibri"/>
+          <w:color w:val="1F2937"/>
+          <w:sz w:val="20"/>
+          <w:lang w:val="it-IT"/>
+        </w:rPr>
+        <w:t>.</w:t>
       </w:r>
     </w:p>
     <w:tbl>
@@ -1353,6 +1485,7 @@
             <w:pPr>
               <w:spacing w:after="0"/>
             </w:pPr>
+            <w:proofErr w:type="spellStart"/>
             <w:r>
               <w:rPr>
                 <w:rFonts w:ascii="Calibri" w:hAnsi="Calibri"/>
@@ -1362,6 +1495,7 @@
               </w:rPr>
               <w:t>Obbligatorio</w:t>
             </w:r>
+            <w:proofErr w:type="spellEnd"/>
           </w:p>
         </w:tc>
         <w:tc>
@@ -1379,6 +1513,7 @@
             <w:pPr>
               <w:spacing w:after="0"/>
             </w:pPr>
+            <w:proofErr w:type="spellStart"/>
             <w:r>
               <w:rPr>
                 <w:rFonts w:ascii="Calibri" w:hAnsi="Calibri"/>
@@ -1386,8 +1521,29 @@
                 <w:color w:val="FFFFFF"/>
                 <w:sz w:val="18"/>
               </w:rPr>
-              <w:t>Descrizione / Valori Ammessi</w:t>
-            </w:r>
+              <w:t>Descrizione</w:t>
+            </w:r>
+            <w:proofErr w:type="spellEnd"/>
+            <w:r>
+              <w:rPr>
+                <w:rFonts w:ascii="Calibri" w:hAnsi="Calibri"/>
+                <w:b/>
+                <w:color w:val="FFFFFF"/>
+                <w:sz w:val="18"/>
+              </w:rPr>
+              <w:t xml:space="preserve"> / Valori </w:t>
+            </w:r>
+            <w:proofErr w:type="spellStart"/>
+            <w:r>
+              <w:rPr>
+                <w:rFonts w:ascii="Calibri" w:hAnsi="Calibri"/>
+                <w:b/>
+                <w:color w:val="FFFFFF"/>
+                <w:sz w:val="18"/>
+              </w:rPr>
+              <w:t>Ammessi</w:t>
+            </w:r>
+            <w:proofErr w:type="spellEnd"/>
           </w:p>
         </w:tc>
       </w:tr>
@@ -1410,6 +1566,7 @@
             <w:pPr>
               <w:spacing w:after="0"/>
             </w:pPr>
+            <w:proofErr w:type="spellStart"/>
             <w:r>
               <w:rPr>
                 <w:rFonts w:ascii="Consolas" w:hAnsi="Consolas"/>
@@ -1418,6 +1575,7 @@
               </w:rPr>
               <w:t>measurement_type</w:t>
             </w:r>
+            <w:proofErr w:type="spellEnd"/>
           </w:p>
         </w:tc>
         <w:tc>
@@ -1460,6 +1618,7 @@
             <w:pPr>
               <w:spacing w:after="0"/>
             </w:pPr>
+            <w:proofErr w:type="spellStart"/>
             <w:r>
               <w:rPr>
                 <w:rFonts w:ascii="Calibri" w:hAnsi="Calibri"/>
@@ -1468,6 +1627,7 @@
               </w:rPr>
               <w:t>Sì</w:t>
             </w:r>
+            <w:proofErr w:type="spellEnd"/>
           </w:p>
         </w:tc>
         <w:tc>
@@ -1611,6 +1771,7 @@
             <w:pPr>
               <w:spacing w:after="0"/>
             </w:pPr>
+            <w:proofErr w:type="spellStart"/>
             <w:r>
               <w:rPr>
                 <w:rFonts w:ascii="Calibri" w:hAnsi="Calibri"/>
@@ -1619,6 +1780,7 @@
               </w:rPr>
               <w:t>Sì</w:t>
             </w:r>
+            <w:proofErr w:type="spellEnd"/>
           </w:p>
         </w:tc>
         <w:tc>
@@ -1722,6 +1884,7 @@
             <w:pPr>
               <w:spacing w:after="0"/>
             </w:pPr>
+            <w:proofErr w:type="spellStart"/>
             <w:r>
               <w:rPr>
                 <w:rFonts w:ascii="Calibri" w:hAnsi="Calibri"/>
@@ -1730,6 +1893,7 @@
               </w:rPr>
               <w:t>Sì</w:t>
             </w:r>
+            <w:proofErr w:type="spellEnd"/>
           </w:p>
         </w:tc>
         <w:tc>
@@ -2301,6 +2465,7 @@
             <w:pPr>
               <w:spacing w:after="0"/>
             </w:pPr>
+            <w:proofErr w:type="spellStart"/>
             <w:r>
               <w:rPr>
                 <w:rFonts w:ascii="Calibri" w:hAnsi="Calibri"/>
@@ -2310,6 +2475,7 @@
               </w:rPr>
               <w:t>Significato</w:t>
             </w:r>
+            <w:proofErr w:type="spellEnd"/>
           </w:p>
         </w:tc>
       </w:tr>
@@ -2536,7 +2702,139 @@
                 <w:sz w:val="18"/>
                 <w:lang w:val="it-IT"/>
               </w:rPr>
-              <w:t>Indice di confidenza della previsione, normalizzato tra 0.0 e 1.0 (arrotondato a 3 cifre decimali).</w:t>
+              <w:t>Probabilità</w:t>
+            </w:r>
+            <w:r>
+              <w:rPr>
+                <w:rFonts w:ascii="Calibri" w:hAnsi="Calibri"/>
+                <w:color w:val="1F2937"/>
+                <w:sz w:val="18"/>
+                <w:lang w:val="it-IT"/>
+              </w:rPr>
+              <w:t xml:space="preserve"> della pre</w:t>
+            </w:r>
+            <w:r>
+              <w:rPr>
+                <w:rFonts w:ascii="Calibri" w:hAnsi="Calibri"/>
+                <w:color w:val="1F2937"/>
+                <w:sz w:val="18"/>
+                <w:lang w:val="it-IT"/>
+              </w:rPr>
+              <w:t>dizione, valore compreso</w:t>
+            </w:r>
+            <w:r>
+              <w:rPr>
+                <w:rFonts w:ascii="Calibri" w:hAnsi="Calibri"/>
+                <w:color w:val="1F2937"/>
+                <w:sz w:val="18"/>
+                <w:lang w:val="it-IT"/>
+              </w:rPr>
+              <w:t xml:space="preserve"> tra 0.0 e 1.0 (arrotondato a 3 cifre decimali).</w:t>
+            </w:r>
+          </w:p>
+        </w:tc>
+      </w:tr>
+      <w:tr>
+        <w:trPr>
+          <w:jc w:val="center"/>
+        </w:trPr>
+        <w:tc>
+          <w:tcPr>
+            <w:tcW w:w="2160" w:type="dxa"/>
+            <w:shd w:val="clear" w:color="auto" w:fill="FFFFFF"/>
+            <w:tcMar>
+              <w:top w:w="80" w:type="dxa"/>
+              <w:left w:w="100" w:type="dxa"/>
+              <w:bottom w:w="80" w:type="dxa"/>
+              <w:right w:w="100" w:type="dxa"/>
+            </w:tcMar>
+          </w:tcPr>
+          <w:p>
+            <w:pPr>
+              <w:spacing w:after="0"/>
+              <w:rPr>
+                <w:rFonts w:ascii="Consolas" w:hAnsi="Consolas"/>
+                <w:color w:val="1F2937"/>
+                <w:sz w:val="17"/>
+                <w:lang w:val="it-IT"/>
+              </w:rPr>
+            </w:pPr>
+            <w:proofErr w:type="spellStart"/>
+            <w:r>
+              <w:rPr>
+                <w:rFonts w:ascii="Consolas" w:hAnsi="Consolas"/>
+                <w:color w:val="1F2937"/>
+                <w:sz w:val="17"/>
+                <w:lang w:val="it-IT"/>
+              </w:rPr>
+              <w:t>model_version</w:t>
+            </w:r>
+            <w:proofErr w:type="spellEnd"/>
+          </w:p>
+        </w:tc>
+        <w:tc>
+          <w:tcPr>
+            <w:tcW w:w="1440" w:type="dxa"/>
+            <w:shd w:val="clear" w:color="auto" w:fill="FFFFFF"/>
+            <w:tcMar>
+              <w:top w:w="80" w:type="dxa"/>
+              <w:left w:w="100" w:type="dxa"/>
+              <w:bottom w:w="80" w:type="dxa"/>
+              <w:right w:w="100" w:type="dxa"/>
+            </w:tcMar>
+          </w:tcPr>
+          <w:p>
+            <w:pPr>
+              <w:spacing w:after="0"/>
+              <w:rPr>
+                <w:rFonts w:ascii="Calibri" w:hAnsi="Calibri"/>
+                <w:color w:val="1F2937"/>
+                <w:sz w:val="18"/>
+                <w:lang w:val="it-IT"/>
+              </w:rPr>
+            </w:pPr>
+            <w:proofErr w:type="spellStart"/>
+            <w:r>
+              <w:rPr>
+                <w:rFonts w:ascii="Calibri" w:hAnsi="Calibri"/>
+                <w:color w:val="1F2937"/>
+                <w:sz w:val="18"/>
+                <w:lang w:val="it-IT"/>
+              </w:rPr>
+              <w:t>string</w:t>
+            </w:r>
+            <w:proofErr w:type="spellEnd"/>
+          </w:p>
+        </w:tc>
+        <w:tc>
+          <w:tcPr>
+            <w:tcW w:w="5760" w:type="dxa"/>
+            <w:shd w:val="clear" w:color="auto" w:fill="FFFFFF"/>
+            <w:tcMar>
+              <w:top w:w="80" w:type="dxa"/>
+              <w:left w:w="100" w:type="dxa"/>
+              <w:bottom w:w="80" w:type="dxa"/>
+              <w:right w:w="100" w:type="dxa"/>
+            </w:tcMar>
+          </w:tcPr>
+          <w:p>
+            <w:pPr>
+              <w:spacing w:after="0"/>
+              <w:rPr>
+                <w:rFonts w:ascii="Calibri" w:hAnsi="Calibri"/>
+                <w:color w:val="1F2937"/>
+                <w:sz w:val="18"/>
+                <w:lang w:val="it-IT"/>
+              </w:rPr>
+            </w:pPr>
+            <w:r>
+              <w:rPr>
+                <w:rFonts w:ascii="Calibri" w:hAnsi="Calibri"/>
+                <w:color w:val="1F2937"/>
+                <w:sz w:val="18"/>
+                <w:lang w:val="it-IT"/>
+              </w:rPr>
+              <w:t>Nome del file del modello usato per l’inferenza.</w:t>
             </w:r>
           </w:p>
         </w:tc>
@@ -2943,16 +3241,39 @@
       <w:pPr>
         <w:spacing w:after="80"/>
         <w:rPr>
-          <w:lang w:val="it-IT"/>
-        </w:rPr>
-      </w:pPr>
-      <w:r>
-        <w:rPr>
           <w:rFonts w:ascii="Calibri" w:hAnsi="Calibri"/>
           <w:color w:val="1F2937"/>
           <w:sz w:val="20"/>
           <w:lang w:val="it-IT"/>
         </w:rPr>
+      </w:pPr>
+    </w:p>
+    <w:p>
+      <w:pPr>
+        <w:spacing w:after="80"/>
+        <w:rPr>
+          <w:rFonts w:ascii="Calibri" w:hAnsi="Calibri"/>
+          <w:color w:val="1F2937"/>
+          <w:sz w:val="20"/>
+          <w:lang w:val="it-IT"/>
+        </w:rPr>
+      </w:pPr>
+    </w:p>
+    <w:p>
+      <w:pPr>
+        <w:spacing w:after="80"/>
+        <w:rPr>
+          <w:lang w:val="it-IT"/>
+        </w:rPr>
+      </w:pPr>
+      <w:r>
+        <w:rPr>
+          <w:rFonts w:ascii="Calibri" w:hAnsi="Calibri"/>
+          <w:color w:val="1F2937"/>
+          <w:sz w:val="20"/>
+          <w:lang w:val="it-IT"/>
+        </w:rPr>
+        <w:lastRenderedPageBreak/>
         <w:t>Esempio di risposta JSON (HTTP 200 OK):</w:t>
       </w:r>
     </w:p>
@@ -2990,12 +3311,19 @@
           <w:p>
             <w:pPr>
               <w:spacing w:after="0"/>
+              <w:rPr>
+                <w:rFonts w:ascii="Consolas" w:hAnsi="Consolas"/>
+                <w:color w:val="1F2937"/>
+                <w:sz w:val="17"/>
+                <w:lang w:val="it-IT"/>
+              </w:rPr>
             </w:pPr>
             <w:r>
               <w:rPr>
                 <w:rFonts w:ascii="Consolas" w:hAnsi="Consolas"/>
                 <w:color w:val="1F2937"/>
                 <w:sz w:val="17"/>
+                <w:lang w:val="it-IT"/>
               </w:rPr>
               <w:t>{</w:t>
             </w:r>
@@ -3004,9 +3332,20 @@
                 <w:rFonts w:ascii="Consolas" w:hAnsi="Consolas"/>
                 <w:color w:val="1F2937"/>
                 <w:sz w:val="17"/>
+                <w:lang w:val="it-IT"/>
               </w:rPr>
               <w:br/>
-              <w:t xml:space="preserve">  "label": "</w:t>
+              <w:t xml:space="preserve">  "label": "decongelato",</w:t>
+            </w:r>
+            <w:r>
+              <w:rPr>
+                <w:rFonts w:ascii="Consolas" w:hAnsi="Consolas"/>
+                <w:color w:val="1F2937"/>
+                <w:sz w:val="17"/>
+                <w:lang w:val="it-IT"/>
+              </w:rPr>
+              <w:br/>
+              <w:t xml:space="preserve">  "</w:t>
             </w:r>
             <w:proofErr w:type="spellStart"/>
             <w:r>
@@ -3014,8 +3353,9 @@
                 <w:rFonts w:ascii="Consolas" w:hAnsi="Consolas"/>
                 <w:color w:val="1F2937"/>
                 <w:sz w:val="17"/>
-              </w:rPr>
-              <w:t>decongelato</w:t>
+                <w:lang w:val="it-IT"/>
+              </w:rPr>
+              <w:t>probability</w:t>
             </w:r>
             <w:proofErr w:type="spellEnd"/>
             <w:r>
@@ -3023,31 +3363,111 @@
                 <w:rFonts w:ascii="Consolas" w:hAnsi="Consolas"/>
                 <w:color w:val="1F2937"/>
                 <w:sz w:val="17"/>
-              </w:rPr>
-              <w:t>",</w:t>
+                <w:lang w:val="it-IT"/>
+              </w:rPr>
+              <w:t>": 0.842</w:t>
             </w:r>
             <w:r>
               <w:rPr>
                 <w:rFonts w:ascii="Consolas" w:hAnsi="Consolas"/>
                 <w:color w:val="1F2937"/>
                 <w:sz w:val="17"/>
-              </w:rPr>
-              <w:br/>
-            </w:r>
+                <w:lang w:val="it-IT"/>
+              </w:rPr>
+              <w:t>,</w:t>
+            </w:r>
+          </w:p>
+          <w:p>
+            <w:pPr>
+              <w:spacing w:after="0"/>
+              <w:rPr>
+                <w:lang w:val="it-IT"/>
+              </w:rPr>
+            </w:pPr>
             <w:r>
               <w:rPr>
                 <w:rFonts w:ascii="Consolas" w:hAnsi="Consolas"/>
                 <w:color w:val="1F2937"/>
                 <w:sz w:val="17"/>
-              </w:rPr>
-              <w:lastRenderedPageBreak/>
-              <w:t xml:space="preserve">  "probability": 0.842</w:t>
-            </w:r>
+                <w:lang w:val="it-IT"/>
+              </w:rPr>
+              <w:t xml:space="preserve">  "</w:t>
+            </w:r>
+            <w:proofErr w:type="spellStart"/>
             <w:r>
               <w:rPr>
                 <w:rFonts w:ascii="Consolas" w:hAnsi="Consolas"/>
                 <w:color w:val="1F2937"/>
                 <w:sz w:val="17"/>
+                <w:lang w:val="it-IT"/>
+              </w:rPr>
+              <w:t>model_version</w:t>
+            </w:r>
+            <w:proofErr w:type="spellEnd"/>
+            <w:r>
+              <w:rPr>
+                <w:rFonts w:ascii="Consolas" w:hAnsi="Consolas"/>
+                <w:color w:val="1F2937"/>
+                <w:sz w:val="17"/>
+                <w:lang w:val="it-IT"/>
+              </w:rPr>
+              <w:t>":</w:t>
+            </w:r>
+            <w:r>
+              <w:rPr>
+                <w:rFonts w:ascii="Consolas" w:hAnsi="Consolas"/>
+                <w:color w:val="1F2937"/>
+                <w:sz w:val="17"/>
+                <w:lang w:val="it-IT"/>
+              </w:rPr>
+              <w:t xml:space="preserve"> </w:t>
+            </w:r>
+            <w:r>
+              <w:rPr>
+                <w:rFonts w:ascii="Consolas" w:hAnsi="Consolas"/>
+                <w:color w:val="1F2937"/>
+                <w:sz w:val="17"/>
+                <w:lang w:val="it-IT"/>
+              </w:rPr>
+              <w:t>"</w:t>
+            </w:r>
+            <w:proofErr w:type="spellStart"/>
+            <w:r>
+              <w:rPr>
+                <w:rFonts w:ascii="Consolas" w:hAnsi="Consolas"/>
+                <w:color w:val="1F2937"/>
+                <w:sz w:val="17"/>
+                <w:lang w:val="it-IT"/>
+              </w:rPr>
+              <w:t>cnn_micronir_path_</w:t>
+            </w:r>
+            <w:proofErr w:type="gramStart"/>
+            <w:r>
+              <w:rPr>
+                <w:rFonts w:ascii="Consolas" w:hAnsi="Consolas"/>
+                <w:color w:val="1F2937"/>
+                <w:sz w:val="17"/>
+                <w:lang w:val="it-IT"/>
+              </w:rPr>
+              <w:t>polpo.keras</w:t>
+            </w:r>
+            <w:proofErr w:type="spellEnd"/>
+            <w:proofErr w:type="gramEnd"/>
+            <w:r>
+              <w:rPr>
+                <w:rFonts w:ascii="Consolas" w:hAnsi="Consolas"/>
+                <w:color w:val="1F2937"/>
+                <w:sz w:val="17"/>
+                <w:lang w:val="it-IT"/>
+              </w:rPr>
+              <w:t>"</w:t>
+            </w:r>
+            <w:r>
+              <w:rPr>
+                <w:rFonts w:ascii="Consolas" w:hAnsi="Consolas"/>
+                <w:color w:val="1F2937"/>
+                <w:sz w:val="17"/>
+                <w:lang w:val="it-IT"/>
               </w:rPr>
               <w:br/>
               <w:t>}</w:t>
@@ -3059,11 +3479,15 @@
     <w:p>
       <w:pPr>
         <w:spacing w:after="80"/>
+        <w:rPr>
+          <w:lang w:val="it-IT"/>
+        </w:rPr>
       </w:pPr>
     </w:p>
     <w:p>
       <w:pPr>
         <w:spacing w:after="80"/>
+        <w:jc w:val="both"/>
         <w:rPr>
           <w:lang w:val="it-IT"/>
         </w:rPr>
@@ -3075,7 +3499,25 @@
           <w:sz w:val="20"/>
           <w:lang w:val="it-IT"/>
         </w:rPr>
-        <w:t>Interpretazione: Il campione analizzato è stato classificato come DECONGELATO con un livello di confidenza del 84.2%.</w:t>
+        <w:t>Interpretazione: Il campione analizzato è stato classificato come DECONGELATO con un</w:t>
+      </w:r>
+      <w:r>
+        <w:rPr>
+          <w:rFonts w:ascii="Calibri" w:hAnsi="Calibri"/>
+          <w:color w:val="1F2937"/>
+          <w:sz w:val="20"/>
+          <w:lang w:val="it-IT"/>
+        </w:rPr>
+        <w:t>a probabilità</w:t>
+      </w:r>
+      <w:r>
+        <w:rPr>
+          <w:rFonts w:ascii="Calibri" w:hAnsi="Calibri"/>
+          <w:color w:val="1F2937"/>
+          <w:sz w:val="20"/>
+          <w:lang w:val="it-IT"/>
+        </w:rPr>
+        <w:t xml:space="preserve"> del 84%.</w:t>
       </w:r>
     </w:p>
     <w:p>
@@ -3100,6 +3542,7 @@
     <w:p>
       <w:pPr>
         <w:spacing w:after="80"/>
+        <w:jc w:val="both"/>
         <w:rPr>
           <w:lang w:val="it-IT"/>
         </w:rPr>
@@ -3178,6 +3621,7 @@
     <w:p>
       <w:pPr>
         <w:spacing w:after="80"/>
+        <w:jc w:val="both"/>
         <w:rPr>
           <w:lang w:val="it-IT"/>
         </w:rPr>
@@ -3397,9 +3841,20 @@
                 <w:sz w:val="17"/>
                 <w:lang w:val="it-IT"/>
               </w:rPr>
-              <w:t>": { "</w:t>
+              <w:t xml:space="preserve">": </w:t>
+            </w:r>
+            <w:proofErr w:type="gramStart"/>
+            <w:r>
+              <w:rPr>
+                <w:rFonts w:ascii="Consolas" w:hAnsi="Consolas"/>
+                <w:color w:val="1F2937"/>
+                <w:sz w:val="17"/>
+                <w:lang w:val="it-IT"/>
+              </w:rPr>
+              <w:t>{ "</w:t>
             </w:r>
             <w:proofErr w:type="spellStart"/>
+            <w:proofErr w:type="gramEnd"/>
             <w:r>
               <w:rPr>
                 <w:rFonts w:ascii="Consolas" w:hAnsi="Consolas"/>
@@ -3607,8 +4062,9 @@
                 <w:lang w:val="it-IT"/>
               </w:rPr>
               <w:br/>
-              <w:t xml:space="preserve">    }</w:t>
-            </w:r>
+              <w:t xml:space="preserve">  </w:t>
+            </w:r>
+            <w:proofErr w:type="gramStart"/>
             <w:r>
               <w:rPr>
                 <w:rFonts w:ascii="Consolas" w:hAnsi="Consolas"/>
@@ -3616,9 +4072,29 @@
                 <w:sz w:val="17"/>
                 <w:lang w:val="it-IT"/>
               </w:rPr>
+              <w:t xml:space="preserve">  }</w:t>
+            </w:r>
+            <w:proofErr w:type="gramEnd"/>
+            <w:r>
+              <w:rPr>
+                <w:rFonts w:ascii="Consolas" w:hAnsi="Consolas"/>
+                <w:color w:val="1F2937"/>
+                <w:sz w:val="17"/>
+                <w:lang w:val="it-IT"/>
+              </w:rPr>
               <w:br/>
+            </w:r>
+            <w:proofErr w:type="gramStart"/>
+            <w:r>
+              <w:rPr>
+                <w:rFonts w:ascii="Consolas" w:hAnsi="Consolas"/>
+                <w:color w:val="1F2937"/>
+                <w:sz w:val="17"/>
+                <w:lang w:val="it-IT"/>
+              </w:rPr>
               <w:t xml:space="preserve">  }</w:t>
             </w:r>
+            <w:proofErr w:type="gramEnd"/>
             <w:r>
               <w:rPr>
                 <w:rFonts w:ascii="Consolas" w:hAnsi="Consolas"/>
@@ -3743,6 +4219,7 @@
     <w:p>
       <w:pPr>
         <w:spacing w:after="80"/>
+        <w:jc w:val="both"/>
         <w:rPr>
           <w:lang w:val="it-IT"/>
         </w:rPr>
@@ -3827,12 +4304,19 @@
           <w:p>
             <w:pPr>
               <w:spacing w:after="0"/>
+              <w:rPr>
+                <w:rFonts w:ascii="Consolas" w:hAnsi="Consolas"/>
+                <w:color w:val="1F2937"/>
+                <w:sz w:val="17"/>
+                <w:lang w:val="it-IT"/>
+              </w:rPr>
             </w:pPr>
             <w:r>
               <w:rPr>
                 <w:rFonts w:ascii="Consolas" w:hAnsi="Consolas"/>
                 <w:color w:val="1F2937"/>
                 <w:sz w:val="17"/>
+                <w:lang w:val="it-IT"/>
               </w:rPr>
               <w:t>GET /models</w:t>
             </w:r>
@@ -3841,6 +4325,7 @@
                 <w:rFonts w:ascii="Consolas" w:hAnsi="Consolas"/>
                 <w:color w:val="1F2937"/>
                 <w:sz w:val="17"/>
+                <w:lang w:val="it-IT"/>
               </w:rPr>
               <w:br/>
             </w:r>
@@ -3849,32 +4334,17 @@
                 <w:rFonts w:ascii="Consolas" w:hAnsi="Consolas"/>
                 <w:color w:val="1F2937"/>
                 <w:sz w:val="17"/>
+                <w:lang w:val="it-IT"/>
               </w:rPr>
               <w:br/>
-            </w:r>
-            <w:proofErr w:type="spellStart"/>
+              <w:t>Risposta JSON:</w:t>
+            </w:r>
             <w:r>
               <w:rPr>
                 <w:rFonts w:ascii="Consolas" w:hAnsi="Consolas"/>
                 <w:color w:val="1F2937"/>
                 <w:sz w:val="17"/>
-              </w:rPr>
-              <w:t>Risposta</w:t>
-            </w:r>
-            <w:proofErr w:type="spellEnd"/>
-            <w:r>
-              <w:rPr>
-                <w:rFonts w:ascii="Consolas" w:hAnsi="Consolas"/>
-                <w:color w:val="1F2937"/>
-                <w:sz w:val="17"/>
-              </w:rPr>
-              <w:t xml:space="preserve"> JSON:</w:t>
-            </w:r>
-            <w:r>
-              <w:rPr>
-                <w:rFonts w:ascii="Consolas" w:hAnsi="Consolas"/>
-                <w:color w:val="1F2937"/>
-                <w:sz w:val="17"/>
+                <w:lang w:val="it-IT"/>
               </w:rPr>
               <w:br/>
               <w:t>{</w:t>
@@ -3884,6 +4354,7 @@
                 <w:rFonts w:ascii="Consolas" w:hAnsi="Consolas"/>
                 <w:color w:val="1F2937"/>
                 <w:sz w:val="17"/>
+                <w:lang w:val="it-IT"/>
               </w:rPr>
               <w:br/>
               <w:t xml:space="preserve">  "models": [</w:t>
@@ -3893,81 +4364,310 @@
                 <w:rFonts w:ascii="Consolas" w:hAnsi="Consolas"/>
                 <w:color w:val="1F2937"/>
                 <w:sz w:val="17"/>
+                <w:lang w:val="it-IT"/>
               </w:rPr>
               <w:br/>
-              <w:t xml:space="preserve">    {</w:t>
-            </w:r>
+              <w:t xml:space="preserve"> </w:t>
+            </w:r>
+            <w:proofErr w:type="gramStart"/>
             <w:r>
               <w:rPr>
                 <w:rFonts w:ascii="Consolas" w:hAnsi="Consolas"/>
                 <w:color w:val="1F2937"/>
                 <w:sz w:val="17"/>
+                <w:lang w:val="it-IT"/>
+              </w:rPr>
+              <w:t xml:space="preserve">   {</w:t>
+            </w:r>
+            <w:proofErr w:type="gramEnd"/>
+            <w:r>
+              <w:rPr>
+                <w:rFonts w:ascii="Consolas" w:hAnsi="Consolas"/>
+                <w:color w:val="1F2937"/>
+                <w:sz w:val="17"/>
+                <w:lang w:val="it-IT"/>
               </w:rPr>
               <w:br/>
-              <w:t xml:space="preserve">      "measurement_type": "nir",</w:t>
-            </w:r>
+              <w:t xml:space="preserve">      "</w:t>
+            </w:r>
+            <w:proofErr w:type="spellStart"/>
             <w:r>
               <w:rPr>
                 <w:rFonts w:ascii="Consolas" w:hAnsi="Consolas"/>
                 <w:color w:val="1F2937"/>
                 <w:sz w:val="17"/>
+                <w:lang w:val="it-IT"/>
+              </w:rPr>
+              <w:t>measurement_type</w:t>
+            </w:r>
+            <w:proofErr w:type="spellEnd"/>
+            <w:r>
+              <w:rPr>
+                <w:rFonts w:ascii="Consolas" w:hAnsi="Consolas"/>
+                <w:color w:val="1F2937"/>
+                <w:sz w:val="17"/>
+                <w:lang w:val="it-IT"/>
+              </w:rPr>
+              <w:t>": "</w:t>
+            </w:r>
+            <w:proofErr w:type="spellStart"/>
+            <w:r>
+              <w:rPr>
+                <w:rFonts w:ascii="Consolas" w:hAnsi="Consolas"/>
+                <w:color w:val="1F2937"/>
+                <w:sz w:val="17"/>
+                <w:lang w:val="it-IT"/>
+              </w:rPr>
+              <w:t>nir</w:t>
+            </w:r>
+            <w:proofErr w:type="spellEnd"/>
+            <w:r>
+              <w:rPr>
+                <w:rFonts w:ascii="Consolas" w:hAnsi="Consolas"/>
+                <w:color w:val="1F2937"/>
+                <w:sz w:val="17"/>
+                <w:lang w:val="it-IT"/>
+              </w:rPr>
+              <w:t>",</w:t>
+            </w:r>
+            <w:r>
+              <w:rPr>
+                <w:rFonts w:ascii="Consolas" w:hAnsi="Consolas"/>
+                <w:color w:val="1F2937"/>
+                <w:sz w:val="17"/>
+                <w:lang w:val="it-IT"/>
               </w:rPr>
               <w:br/>
-              <w:t xml:space="preserve">      "tipo_di_campione": "pesce",</w:t>
             </w:r>
             <w:r>
               <w:rPr>
                 <w:rFonts w:ascii="Consolas" w:hAnsi="Consolas"/>
                 <w:color w:val="1F2937"/>
                 <w:sz w:val="17"/>
+                <w:lang w:val="it-IT"/>
+              </w:rPr>
+              <w:lastRenderedPageBreak/>
+              <w:t xml:space="preserve">      "</w:t>
+            </w:r>
+            <w:proofErr w:type="spellStart"/>
+            <w:r>
+              <w:rPr>
+                <w:rFonts w:ascii="Consolas" w:hAnsi="Consolas"/>
+                <w:color w:val="1F2937"/>
+                <w:sz w:val="17"/>
+                <w:lang w:val="it-IT"/>
+              </w:rPr>
+              <w:t>tipo_di_campione</w:t>
+            </w:r>
+            <w:proofErr w:type="spellEnd"/>
+            <w:r>
+              <w:rPr>
+                <w:rFonts w:ascii="Consolas" w:hAnsi="Consolas"/>
+                <w:color w:val="1F2937"/>
+                <w:sz w:val="17"/>
+                <w:lang w:val="it-IT"/>
+              </w:rPr>
+              <w:t>": "pesce",</w:t>
+            </w:r>
+            <w:r>
+              <w:rPr>
+                <w:rFonts w:ascii="Consolas" w:hAnsi="Consolas"/>
+                <w:color w:val="1F2937"/>
+                <w:sz w:val="17"/>
+                <w:lang w:val="it-IT"/>
               </w:rPr>
               <w:br/>
-              <w:t xml:space="preserve">      "specie_campione": "polpo",</w:t>
-            </w:r>
+              <w:t xml:space="preserve">      "</w:t>
+            </w:r>
+            <w:proofErr w:type="spellStart"/>
             <w:r>
               <w:rPr>
                 <w:rFonts w:ascii="Consolas" w:hAnsi="Consolas"/>
                 <w:color w:val="1F2937"/>
                 <w:sz w:val="17"/>
+                <w:lang w:val="it-IT"/>
+              </w:rPr>
+              <w:t>specie_campione</w:t>
+            </w:r>
+            <w:proofErr w:type="spellEnd"/>
+            <w:r>
+              <w:rPr>
+                <w:rFonts w:ascii="Consolas" w:hAnsi="Consolas"/>
+                <w:color w:val="1F2937"/>
+                <w:sz w:val="17"/>
+                <w:lang w:val="it-IT"/>
+              </w:rPr>
+              <w:t>": "polpo",</w:t>
+            </w:r>
+          </w:p>
+          <w:p>
+            <w:pPr>
+              <w:spacing w:after="0"/>
+            </w:pPr>
+            <w:r>
+              <w:rPr>
+                <w:rFonts w:ascii="Consolas" w:hAnsi="Consolas"/>
+                <w:color w:val="1F2937"/>
+                <w:sz w:val="17"/>
+                <w:lang w:val="it-IT"/>
+              </w:rPr>
+              <w:t xml:space="preserve">      </w:t>
+            </w:r>
+            <w:r>
+              <w:rPr>
+                <w:rFonts w:ascii="Consolas" w:hAnsi="Consolas"/>
+                <w:color w:val="1F2937"/>
+                <w:sz w:val="17"/>
+              </w:rPr>
+              <w:t>"</w:t>
+            </w:r>
+            <w:proofErr w:type="spellStart"/>
+            <w:proofErr w:type="gramStart"/>
+            <w:r>
+              <w:rPr>
+                <w:rFonts w:ascii="Consolas" w:hAnsi="Consolas"/>
+                <w:color w:val="1F2937"/>
+                <w:sz w:val="17"/>
+              </w:rPr>
+              <w:t>model</w:t>
+            </w:r>
+            <w:proofErr w:type="gramEnd"/>
+            <w:r>
+              <w:rPr>
+                <w:rFonts w:ascii="Consolas" w:hAnsi="Consolas"/>
+                <w:color w:val="1F2937"/>
+                <w:sz w:val="17"/>
+              </w:rPr>
+              <w:t>_version</w:t>
+            </w:r>
+            <w:proofErr w:type="spellEnd"/>
+            <w:r>
+              <w:rPr>
+                <w:rFonts w:ascii="Consolas" w:hAnsi="Consolas"/>
+                <w:color w:val="1F2937"/>
+                <w:sz w:val="17"/>
+              </w:rPr>
+              <w:t>": "</w:t>
+            </w:r>
+            <w:proofErr w:type="spellStart"/>
+            <w:r>
+              <w:rPr>
+                <w:rFonts w:ascii="Consolas" w:hAnsi="Consolas"/>
+                <w:color w:val="1F2937"/>
+                <w:sz w:val="17"/>
+              </w:rPr>
+              <w:t>cnn_micronir_path_</w:t>
+            </w:r>
+            <w:proofErr w:type="gramStart"/>
+            <w:r>
+              <w:rPr>
+                <w:rFonts w:ascii="Consolas" w:hAnsi="Consolas"/>
+                <w:color w:val="1F2937"/>
+                <w:sz w:val="17"/>
+              </w:rPr>
+              <w:t>polpo.keras</w:t>
+            </w:r>
+            <w:proofErr w:type="spellEnd"/>
+            <w:proofErr w:type="gramEnd"/>
+            <w:r>
+              <w:rPr>
+                <w:rFonts w:ascii="Consolas" w:hAnsi="Consolas"/>
+                <w:color w:val="1F2937"/>
+                <w:sz w:val="17"/>
+              </w:rPr>
+              <w:t>",</w:t>
+            </w:r>
+            <w:r>
+              <w:rPr>
+                <w:rFonts w:ascii="Consolas" w:hAnsi="Consolas"/>
+                <w:color w:val="1F2937"/>
+                <w:sz w:val="17"/>
               </w:rPr>
               <w:br/>
-              <w:t xml:space="preserve">      "is_file_present": true,</w:t>
-            </w:r>
+              <w:t xml:space="preserve">      "</w:t>
+            </w:r>
+            <w:proofErr w:type="spellStart"/>
             <w:r>
               <w:rPr>
                 <w:rFonts w:ascii="Consolas" w:hAnsi="Consolas"/>
                 <w:color w:val="1F2937"/>
                 <w:sz w:val="17"/>
               </w:rPr>
+              <w:t>is_file_present</w:t>
+            </w:r>
+            <w:proofErr w:type="spellEnd"/>
+            <w:r>
+              <w:rPr>
+                <w:rFonts w:ascii="Consolas" w:hAnsi="Consolas"/>
+                <w:color w:val="1F2937"/>
+                <w:sz w:val="17"/>
+              </w:rPr>
+              <w:t>": true,</w:t>
+            </w:r>
+            <w:r>
+              <w:rPr>
+                <w:rFonts w:ascii="Consolas" w:hAnsi="Consolas"/>
+                <w:color w:val="1F2937"/>
+                <w:sz w:val="17"/>
+              </w:rPr>
               <w:br/>
-            </w:r>
+              <w:t xml:space="preserve">      "</w:t>
+            </w:r>
+            <w:proofErr w:type="spellStart"/>
             <w:r>
               <w:rPr>
                 <w:rFonts w:ascii="Consolas" w:hAnsi="Consolas"/>
                 <w:color w:val="1F2937"/>
                 <w:sz w:val="17"/>
               </w:rPr>
-              <w:lastRenderedPageBreak/>
-              <w:t xml:space="preserve">      "is_loaded_in_memory": true</w:t>
-            </w:r>
+              <w:t>is_loaded_in_memory</w:t>
+            </w:r>
+            <w:proofErr w:type="spellEnd"/>
             <w:r>
               <w:rPr>
                 <w:rFonts w:ascii="Consolas" w:hAnsi="Consolas"/>
                 <w:color w:val="1F2937"/>
                 <w:sz w:val="17"/>
               </w:rPr>
+              <w:t>": true</w:t>
+            </w:r>
+            <w:r>
+              <w:rPr>
+                <w:rFonts w:ascii="Consolas" w:hAnsi="Consolas"/>
+                <w:color w:val="1F2937"/>
+                <w:sz w:val="17"/>
+              </w:rPr>
               <w:br/>
-              <w:t xml:space="preserve">    }</w:t>
-            </w:r>
+              <w:t xml:space="preserve">  </w:t>
+            </w:r>
+            <w:proofErr w:type="gramStart"/>
             <w:r>
               <w:rPr>
                 <w:rFonts w:ascii="Consolas" w:hAnsi="Consolas"/>
                 <w:color w:val="1F2937"/>
                 <w:sz w:val="17"/>
               </w:rPr>
+              <w:t xml:space="preserve">  }</w:t>
+            </w:r>
+            <w:proofErr w:type="gramEnd"/>
+            <w:r>
+              <w:rPr>
+                <w:rFonts w:ascii="Consolas" w:hAnsi="Consolas"/>
+                <w:color w:val="1F2937"/>
+                <w:sz w:val="17"/>
+              </w:rPr>
               <w:br/>
+            </w:r>
+            <w:proofErr w:type="gramStart"/>
+            <w:r>
+              <w:rPr>
+                <w:rFonts w:ascii="Consolas" w:hAnsi="Consolas"/>
+                <w:color w:val="1F2937"/>
+                <w:sz w:val="17"/>
+              </w:rPr>
               <w:t xml:space="preserve">  ]</w:t>
             </w:r>
+            <w:proofErr w:type="gramEnd"/>
             <w:r>
               <w:rPr>
                 <w:rFonts w:ascii="Consolas" w:hAnsi="Consolas"/>
@@ -4187,25 +4887,80 @@
                 <w:sz w:val="17"/>
               </w:rPr>
               <w:br/>
-              <w:t xml:space="preserve">  "version": "1.0.0",</w:t>
-            </w:r>
+              <w:t xml:space="preserve">  "</w:t>
+            </w:r>
+            <w:proofErr w:type="spellStart"/>
             <w:r>
               <w:rPr>
                 <w:rFonts w:ascii="Consolas" w:hAnsi="Consolas"/>
                 <w:color w:val="1F2937"/>
                 <w:sz w:val="17"/>
               </w:rPr>
+              <w:t>models_loaded_count</w:t>
+            </w:r>
+            <w:proofErr w:type="spellEnd"/>
+            <w:r>
+              <w:rPr>
+                <w:rFonts w:ascii="Consolas" w:hAnsi="Consolas"/>
+                <w:color w:val="1F2937"/>
+                <w:sz w:val="17"/>
+              </w:rPr>
+              <w:t>": 1,</w:t>
+            </w:r>
+            <w:r>
+              <w:rPr>
+                <w:rFonts w:ascii="Consolas" w:hAnsi="Consolas"/>
+                <w:color w:val="1F2937"/>
+                <w:sz w:val="17"/>
+              </w:rPr>
               <w:br/>
-              <w:t xml:space="preserve">  "models_loaded_count": 1,</w:t>
-            </w:r>
+              <w:t xml:space="preserve">  "</w:t>
+            </w:r>
+            <w:proofErr w:type="spellStart"/>
             <w:r>
               <w:rPr>
                 <w:rFonts w:ascii="Consolas" w:hAnsi="Consolas"/>
                 <w:color w:val="1F2937"/>
                 <w:sz w:val="17"/>
               </w:rPr>
-              <w:br/>
-              <w:t xml:space="preserve">  "models_loaded": ["nir:pesce:polpo"]</w:t>
+              <w:t>models_loaded</w:t>
+            </w:r>
+            <w:proofErr w:type="spellEnd"/>
+            <w:r>
+              <w:rPr>
+                <w:rFonts w:ascii="Consolas" w:hAnsi="Consolas"/>
+                <w:color w:val="1F2937"/>
+                <w:sz w:val="17"/>
+              </w:rPr>
+              <w:t>": ["</w:t>
+            </w:r>
+            <w:proofErr w:type="spellStart"/>
+            <w:r>
+              <w:rPr>
+                <w:rFonts w:ascii="Consolas" w:hAnsi="Consolas"/>
+                <w:color w:val="1F2937"/>
+                <w:sz w:val="17"/>
+              </w:rPr>
+              <w:t>cnn_micronir_path_</w:t>
+            </w:r>
+            <w:proofErr w:type="gramStart"/>
+            <w:r>
+              <w:rPr>
+                <w:rFonts w:ascii="Consolas" w:hAnsi="Consolas"/>
+                <w:color w:val="1F2937"/>
+                <w:sz w:val="17"/>
+              </w:rPr>
+              <w:t>polpo.keras</w:t>
+            </w:r>
+            <w:proofErr w:type="spellEnd"/>
+            <w:proofErr w:type="gramEnd"/>
+            <w:r>
+              <w:rPr>
+                <w:rFonts w:ascii="Consolas" w:hAnsi="Consolas"/>
+                <w:color w:val="1F2937"/>
+                <w:sz w:val="17"/>
+              </w:rPr>
+              <w:t>"]</w:t>
             </w:r>
             <w:r>
               <w:rPr>
@@ -4223,6 +4978,11 @@
     <w:p>
       <w:pPr>
         <w:spacing w:after="80"/>
+        <w:rPr>
+          <w:rFonts w:ascii="Calibri" w:hAnsi="Calibri"/>
+          <w:color w:val="1F2937"/>
+          <w:sz w:val="20"/>
+        </w:rPr>
       </w:pPr>
     </w:p>
     <w:p>
@@ -5058,7 +5818,7 @@
                 <w:sz w:val="18"/>
                 <w:lang w:val="it-IT"/>
               </w:rPr>
-              <w:t>Restituzione di</w:t>
+              <w:t xml:space="preserve">Restituzione </w:t>
             </w:r>
             <w:r>
               <w:rPr>
@@ -5067,9 +5827,8 @@
                 <w:sz w:val="18"/>
                 <w:lang w:val="it-IT"/>
               </w:rPr>
-              <w:t xml:space="preserve"> 'label' e '</w:t>
-            </w:r>
-            <w:proofErr w:type="spellStart"/>
+              <w:t>della etichetta, probabilità e nome del file del modello</w:t>
+            </w:r>
             <w:r>
               <w:rPr>
                 <w:rFonts w:ascii="Calibri" w:hAnsi="Calibri"/>
@@ -5077,17 +5836,7 @@
                 <w:sz w:val="18"/>
                 <w:lang w:val="it-IT"/>
               </w:rPr>
-              <w:t>probability</w:t>
-            </w:r>
-            <w:proofErr w:type="spellEnd"/>
-            <w:r>
-              <w:rPr>
-                <w:rFonts w:ascii="Calibri" w:hAnsi="Calibri"/>
-                <w:color w:val="1F2937"/>
-                <w:sz w:val="18"/>
-                <w:lang w:val="it-IT"/>
-              </w:rPr>
-              <w:t>'.</w:t>
+              <w:t>.</w:t>
             </w:r>
           </w:p>
         </w:tc>
@@ -5250,7 +5999,61 @@
                 <w:color w:val="1F2937"/>
                 <w:sz w:val="18"/>
               </w:rPr>
-              <w:t>Header Authorization mancante o token non valido.</w:t>
+              <w:t xml:space="preserve">Header Authorization </w:t>
+            </w:r>
+            <w:proofErr w:type="spellStart"/>
+            <w:r>
+              <w:rPr>
+                <w:rFonts w:ascii="Calibri" w:hAnsi="Calibri"/>
+                <w:color w:val="1F2937"/>
+                <w:sz w:val="18"/>
+              </w:rPr>
+              <w:t>mancante</w:t>
+            </w:r>
+            <w:proofErr w:type="spellEnd"/>
+            <w:r>
+              <w:rPr>
+                <w:rFonts w:ascii="Calibri" w:hAnsi="Calibri"/>
+                <w:color w:val="1F2937"/>
+                <w:sz w:val="18"/>
+              </w:rPr>
+              <w:t xml:space="preserve"> </w:t>
+            </w:r>
+            <w:proofErr w:type="gramStart"/>
+            <w:r>
+              <w:rPr>
+                <w:rFonts w:ascii="Calibri" w:hAnsi="Calibri"/>
+                <w:color w:val="1F2937"/>
+                <w:sz w:val="18"/>
+              </w:rPr>
+              <w:t>o token</w:t>
+            </w:r>
+            <w:proofErr w:type="gramEnd"/>
+            <w:r>
+              <w:rPr>
+                <w:rFonts w:ascii="Calibri" w:hAnsi="Calibri"/>
+                <w:color w:val="1F2937"/>
+                <w:sz w:val="18"/>
+              </w:rPr>
+              <w:t xml:space="preserve"> non </w:t>
+            </w:r>
+            <w:proofErr w:type="spellStart"/>
+            <w:r>
+              <w:rPr>
+                <w:rFonts w:ascii="Calibri" w:hAnsi="Calibri"/>
+                <w:color w:val="1F2937"/>
+                <w:sz w:val="18"/>
+              </w:rPr>
+              <w:t>valido</w:t>
+            </w:r>
+            <w:proofErr w:type="spellEnd"/>
+            <w:r>
+              <w:rPr>
+                <w:rFonts w:ascii="Calibri" w:hAnsi="Calibri"/>
+                <w:color w:val="1F2937"/>
+                <w:sz w:val="18"/>
+              </w:rPr>
+              <w:t>.</w:t>
             </w:r>
           </w:p>
         </w:tc>
@@ -5269,13 +6072,59 @@
             <w:pPr>
               <w:spacing w:after="0"/>
             </w:pPr>
+            <w:proofErr w:type="spellStart"/>
             <w:r>
               <w:rPr>
                 <w:rFonts w:ascii="Calibri" w:hAnsi="Calibri"/>
                 <w:color w:val="1F2937"/>
                 <w:sz w:val="18"/>
               </w:rPr>
-              <w:t>Includere l'header 'Authorization: Bearer &lt;TOKEN&gt;' corretto.</w:t>
+              <w:t>Includere</w:t>
+            </w:r>
+            <w:proofErr w:type="spellEnd"/>
+            <w:r>
+              <w:rPr>
+                <w:rFonts w:ascii="Calibri" w:hAnsi="Calibri"/>
+                <w:color w:val="1F2937"/>
+                <w:sz w:val="18"/>
+              </w:rPr>
+              <w:t xml:space="preserve"> </w:t>
+            </w:r>
+            <w:proofErr w:type="spellStart"/>
+            <w:r>
+              <w:rPr>
+                <w:rFonts w:ascii="Calibri" w:hAnsi="Calibri"/>
+                <w:color w:val="1F2937"/>
+                <w:sz w:val="18"/>
+              </w:rPr>
+              <w:t>l'header</w:t>
+            </w:r>
+            <w:proofErr w:type="spellEnd"/>
+            <w:r>
+              <w:rPr>
+                <w:rFonts w:ascii="Calibri" w:hAnsi="Calibri"/>
+                <w:color w:val="1F2937"/>
+                <w:sz w:val="18"/>
+              </w:rPr>
+              <w:t xml:space="preserve"> 'Authorization: Bearer &lt;TOKEN&gt;' </w:t>
+            </w:r>
+            <w:proofErr w:type="spellStart"/>
+            <w:r>
+              <w:rPr>
+                <w:rFonts w:ascii="Calibri" w:hAnsi="Calibri"/>
+                <w:color w:val="1F2937"/>
+                <w:sz w:val="18"/>
+              </w:rPr>
+              <w:t>corretto</w:t>
+            </w:r>
+            <w:proofErr w:type="spellEnd"/>
+            <w:r>
+              <w:rPr>
+                <w:rFonts w:ascii="Calibri" w:hAnsi="Calibri"/>
+                <w:color w:val="1F2937"/>
+                <w:sz w:val="18"/>
+              </w:rPr>
+              <w:t>.</w:t>
             </w:r>
           </w:p>
         </w:tc>
@@ -5305,6 +6154,7 @@
                 <w:color w:val="1F2937"/>
                 <w:sz w:val="17"/>
               </w:rPr>
+              <w:lastRenderedPageBreak/>
               <w:t>404 Not Found</w:t>
             </w:r>
           </w:p>
@@ -5420,16 +6270,7 @@
                 <w:color w:val="1F2937"/>
                 <w:sz w:val="17"/>
               </w:rPr>
-              <w:t xml:space="preserve"> </w:t>
-            </w:r>
-            <w:r>
-              <w:rPr>
-                <w:rFonts w:ascii="Consolas" w:hAnsi="Consolas"/>
-                <w:color w:val="1F2937"/>
-                <w:sz w:val="17"/>
-              </w:rPr>
-              <w:lastRenderedPageBreak/>
-              <w:t>Entity</w:t>
+              <w:t xml:space="preserve"> Entity</w:t>
             </w:r>
           </w:p>
         </w:tc>
@@ -5461,7 +6302,6 @@
                 <w:sz w:val="18"/>
                 <w:lang w:val="it-IT"/>
               </w:rPr>
-              <w:lastRenderedPageBreak/>
               <w:t>Payload non valido</w:t>
             </w:r>
             <w:r>
@@ -5516,17 +6356,7 @@
                 <w:sz w:val="18"/>
                 <w:lang w:val="it-IT"/>
               </w:rPr>
-              <w:t xml:space="preserve">campi mancanti, tipi errati, </w:t>
-            </w:r>
-            <w:r>
-              <w:rPr>
-                <w:rFonts w:ascii="Calibri" w:hAnsi="Calibri"/>
-                <w:color w:val="1F2937"/>
-                <w:sz w:val="18"/>
-                <w:lang w:val="it-IT"/>
-              </w:rPr>
-              <w:lastRenderedPageBreak/>
-              <w:t>lunghezza vettori errate</w:t>
+              <w:t>campi mancanti, tipi errati, lunghezza vettori errate</w:t>
             </w:r>
             <w:r>
               <w:rPr>
@@ -5591,7 +6421,6 @@
                 <w:sz w:val="18"/>
                 <w:lang w:val="it-IT"/>
               </w:rPr>
-              <w:lastRenderedPageBreak/>
               <w:t xml:space="preserve">Correggere </w:t>
             </w:r>
             <w:r>

</xml_diff>